<commit_message>
Added model (entity) User and enum Role
</commit_message>
<xml_diff>
--- a/docs/Week 1/Sprint 1 Retrospective.docx
+++ b/docs/Week 1/Sprint 1 Retrospective.docx
@@ -407,6 +407,12 @@
       <w:r>
         <w:t>Split large user stories earlier to improve sprint predictability</w:t>
       </w:r>
+    </w:p>
+    <w:p>
+      <w:pPr>
+        <w:pStyle w:val="ListParagraph"/>
+        <w:ind w:left="1440"/>
+      </w:pPr>
     </w:p>
     <w:sectPr>
       <w:pgSz w:w="12240" w:h="15840"/>

</xml_diff>